<commit_message>
Cruce con Naza: montos y bloque alternativo
Co-Authored-By: Claude Opus 5.5 <noreply@anthropic.com>
Claude-Session: https://claude.ai/code/session_011cHZCWCbXV7WqvXcQ2jLM2
</commit_message>
<xml_diff>
--- a/agentes/mi-negocio/entregables/repesca-24-10-ads-cruce-naza.docx
+++ b/agentes/mi-negocio/entregables/repesca-24-10-ads-cruce-naza.docx
@@ -78,7 +78,7 @@
         <w:t xml:space="preserve"> </w:t>
       </w:r>
       <w:r>
-        <w:t xml:space="preserve">"Si sos growth" + "cliente estancado en -$30k". Nosotros sumamos un bloque FILTRO en voz (locales, Mercado Libre). En la v2 el filtro pasa al hook ("si tenés un ecommerce de consumibles estancado en 30 millones") y al texto en pantalla y el caption.</w:t>
+        <w:t xml:space="preserve">"Si sos growth" + "cliente estancado en menos de 30k dólares". Nosotros sumamos un bloque FILTRO en voz (locales, Mercado Libre). En la v2 el filtro pasa al hook ("si tenés un ecommerce de consumibles estancado en 30 millones") y al texto en pantalla y el caption.</w:t>
       </w:r>
     </w:p>
     <w:p>
@@ -100,57 +100,7 @@
         <w:t xml:space="preserve"> </w:t>
       </w:r>
       <w:r>
-        <w:t xml:space="preserve">"agarrar un cliente estancado en -</w:t>
-      </w:r>
-      <m:oMath>
-        <m:r>
-          <m:t>30</m:t>
-        </m:r>
-        <m:r>
-          <m:t>k</m:t>
-        </m:r>
-        <m:r>
-          <m:t>y</m:t>
-        </m:r>
-        <m:r>
-          <m:t>e</m:t>
-        </m:r>
-        <m:r>
-          <m:t>s</m:t>
-        </m:r>
-        <m:r>
-          <m:t>c</m:t>
-        </m:r>
-        <m:r>
-          <m:t>a</m:t>
-        </m:r>
-        <m:r>
-          <m:t>l</m:t>
-        </m:r>
-        <m:r>
-          <m:t>a</m:t>
-        </m:r>
-        <m:r>
-          <m:t>r</m:t>
-        </m:r>
-        <m:r>
-          <m:t>l</m:t>
-        </m:r>
-        <m:r>
-          <m:t>o</m:t>
-        </m:r>
-        <m:r>
-          <m:t>a</m:t>
-        </m:r>
-        <m:r>
-          <m:rPr>
-            <m:sty m:val="p"/>
-          </m:rPr>
-          <m:t>+</m:t>
-        </m:r>
-      </m:oMath>
-      <w:r>
-        <w:t xml:space="preserve">100k haciendo una sola cosa". Al nuestro le faltaba esa frase. En la v2: "agarrar un ecom estancado en 30 millones y escalarlo a más de 100 millones por mes haciendo una sola cosa".</w:t>
+        <w:t xml:space="preserve">"agarrar un cliente estancado en menos de 30k dólares y escalarlo a más de 100k haciendo una sola cosa". Al nuestro le faltaba esa frase. En la v2: "agarrar un ecom estancado en 30 millones y escalarlo a más de 100 millones por mes haciendo una sola cosa".</w:t>
       </w:r>
     </w:p>
     <w:p>
@@ -393,57 +343,7 @@
               <w:jc w:val="left"/>
             </w:pPr>
             <w:r>
-              <w:t xml:space="preserve">"Así que si sos growth te voy a explicar cómo podés agarrar un cliente estancado en -</w:t>
-            </w:r>
-            <m:oMath>
-              <m:r>
-                <m:t>30</m:t>
-              </m:r>
-              <m:r>
-                <m:t>k</m:t>
-              </m:r>
-              <m:r>
-                <m:t>y</m:t>
-              </m:r>
-              <m:r>
-                <m:t>e</m:t>
-              </m:r>
-              <m:r>
-                <m:t>s</m:t>
-              </m:r>
-              <m:r>
-                <m:t>c</m:t>
-              </m:r>
-              <m:r>
-                <m:t>a</m:t>
-              </m:r>
-              <m:r>
-                <m:t>l</m:t>
-              </m:r>
-              <m:r>
-                <m:t>a</m:t>
-              </m:r>
-              <m:r>
-                <m:t>r</m:t>
-              </m:r>
-              <m:r>
-                <m:t>l</m:t>
-              </m:r>
-              <m:r>
-                <m:t>o</m:t>
-              </m:r>
-              <m:r>
-                <m:t>a</m:t>
-              </m:r>
-              <m:r>
-                <m:rPr>
-                  <m:sty m:val="p"/>
-                </m:rPr>
-                <m:t>+</m:t>
-              </m:r>
-            </m:oMath>
-            <w:r>
-              <w:t xml:space="preserve">100k por mes haciendo una sola cosa"</w:t>
+              <w:t xml:space="preserve">"Así que si sos growth te voy a explicar cómo podés agarrar un cliente estancado en menos de 30k dólares y escalarlo a más de 100k por mes haciendo una sola cosa"</w:t>
             </w:r>
           </w:p>
         </w:tc>
@@ -2348,27 +2248,35 @@
       <w:r>
         <w:t xml:space="preserve">Te voy a contar tres casos rápido, que estaban en tu misma situación.</w:t>
       </w:r>
-      <w:r>
-        <w:t xml:space="preserve"> </w:t>
-      </w:r>
+    </w:p>
+    <w:p>
+      <w:pPr>
+        <w:pStyle w:val="BlockText"/>
+      </w:pPr>
       <w:r>
         <w:t xml:space="preserve">[NOMBRE], [rubro]. [Situación antes, en una línea]. [Resultado con número].</w:t>
       </w:r>
-      <w:r>
-        <w:t xml:space="preserve"> </w:t>
-      </w:r>
+    </w:p>
+    <w:p>
+      <w:pPr>
+        <w:pStyle w:val="BlockText"/>
+      </w:pPr>
       <w:r>
         <w:t xml:space="preserve">Después, [NOMBRE], [rubro]. [Situación]. [Resultado].</w:t>
       </w:r>
-      <w:r>
-        <w:t xml:space="preserve"> </w:t>
-      </w:r>
+    </w:p>
+    <w:p>
+      <w:pPr>
+        <w:pStyle w:val="BlockText"/>
+      </w:pPr>
       <w:r>
         <w:t xml:space="preserve">Y por último, [NOMBRE], [rubro]. [Situación]. [Resultado].</w:t>
       </w:r>
-      <w:r>
-        <w:t xml:space="preserve"> </w:t>
-      </w:r>
+    </w:p>
+    <w:p>
+      <w:pPr>
+        <w:pStyle w:val="BlockText"/>
+      </w:pPr>
       <w:r>
         <w:t xml:space="preserve">Y hay una cosa que tienen en común: los tres empezaron desde una clase privada igual a la que te estoy por invitar.</w:t>
       </w:r>

</xml_diff>